<commit_message>
nmv 19 10 2026
</commit_message>
<xml_diff>
--- a/TS Jatai Ghanam Project/TS 4.4/TS 4.4 Ghanam Sanskrit Corrections.docx
+++ b/TS Jatai Ghanam Project/TS 4.4/TS 4.4 Ghanam Sanskrit Corrections.docx
@@ -1167,7 +1167,26 @@
                 <w:sz w:val="32"/>
                 <w:szCs w:val="32"/>
               </w:rPr>
-              <w:t>ÍqÉ</w:t>
+              <w:t>Í</w:t>
+            </w:r>
+            <w:r>
+              <w:rPr>
+                <w:rFonts w:ascii="BRH Devanagari Extra" w:hAnsi="BRH Devanagari Extra" w:cs="BRH Devanagari Extra"/>
+                <w:color w:val="000000"/>
+                <w:sz w:val="32"/>
+                <w:szCs w:val="32"/>
+                <w:highlight w:val="yellow"/>
+              </w:rPr>
+              <w:t>q</w:t>
+            </w:r>
+            <w:r>
+              <w:rPr>
+                <w:rFonts w:ascii="BRH Devanagari Extra" w:hAnsi="BRH Devanagari Extra" w:cs="BRH Devanagari Extra"/>
+                <w:color w:val="000000"/>
+                <w:sz w:val="32"/>
+                <w:szCs w:val="32"/>
+              </w:rPr>
+              <w:t>É</w:t>
             </w:r>
             <w:r>
               <w:rPr>
@@ -2592,16 +2611,42 @@
                 <w:sz w:val="32"/>
                 <w:szCs w:val="32"/>
               </w:rPr>
-              <w:t>lÉÑ ÍqÉ</w:t>
-            </w:r>
-            <w:r>
-              <w:rPr>
-                <w:rFonts w:ascii="BRH Malayalam Extra" w:hAnsi="BRH Malayalam Extra" w:cs="BRH Devanagari Extra"/>
-                <w:color w:val="000000"/>
-                <w:sz w:val="26"/>
-                <w:szCs w:val="32"/>
-              </w:rPr>
-              <w:t>–</w:t>
+              <w:t xml:space="preserve">lÉÑ </w:t>
+            </w:r>
+          </w:p>
+          <w:p>
+            <w:pPr>
+              <w:widowControl w:val="0"/>
+              <w:autoSpaceDE w:val="0"/>
+              <w:autoSpaceDN w:val="0"/>
+              <w:adjustRightInd w:val="0"/>
+              <w:spacing w:before="0" w:line="240" w:lineRule="auto"/>
+              <w:rPr>
+                <w:rFonts w:ascii="BRH Devanagari Extra" w:hAnsi="BRH Devanagari Extra" w:cs="BRH Devanagari Extra"/>
+                <w:color w:val="000000"/>
+                <w:sz w:val="32"/>
+                <w:szCs w:val="32"/>
+              </w:rPr>
+            </w:pPr>
+            <w:r>
+              <w:rPr>
+                <w:rFonts w:ascii="BRH Devanagari Extra" w:hAnsi="BRH Devanagari Extra" w:cs="BRH Devanagari Extra"/>
+                <w:color w:val="000000"/>
+                <w:sz w:val="32"/>
+                <w:szCs w:val="32"/>
+                <w:highlight w:val="green"/>
+              </w:rPr>
+              <w:t>ÍqÉ</w:t>
+            </w:r>
+            <w:r>
+              <w:rPr>
+                <w:rFonts w:ascii="BRH Devanagari Extra" w:hAnsi="BRH Devanagari Extra" w:cs="BRH Devanagari Extra"/>
+                <w:color w:val="000000"/>
+                <w:sz w:val="32"/>
+                <w:szCs w:val="32"/>
+                <w:highlight w:val="green"/>
+              </w:rPr>
+              <w:t>þ</w:t>
             </w:r>
             <w:r>
               <w:rPr>

</xml_diff>